<commit_message>
La Puerta: bibliografía en todas las infografías y declaración de uso de IA ampliada en todos los productos
Co-Authored-By: Claude Sonnet 5.5 <noreply@anthropic.com>
Claude-Session: https://claude.ai/code/session_01LMGDS2vkeoRvyaCNTXCQYn
</commit_message>
<xml_diff>
--- a/La_Puerta_Informes/informes/A_Informe_Descriptivo.docx
+++ b/La_Puerta_Informes/informes/A_Informe_Descriptivo.docx
@@ -793,6 +793,86 @@
         <w:t>El documento se organiza en cinco partes: la Introducción (incluye el resumen ejecutivo y el contexto); el Desarrollo (metodología, participantes, resultados, voz estudiantil y hallazgos); la Conclusión (conclusiones, limitaciones y recomendaciones); las Referencias en formato APA 7; y los Anexos (ficha técnica, robustez y declaración de uso de IA).</w:t>
       </w:r>
     </w:p>
+    <w:tbl>
+      <w:tblPr>
+        <w:tblW w:type="dxa" w:w="9355"/>
+        <w:tblBorders>
+          <w:top w:val="nil"/>
+          <w:left w:val="nil"/>
+          <w:bottom w:val="nil"/>
+          <w:right w:val="nil"/>
+          <w:insideH w:val="nil"/>
+          <w:insideV w:val="nil"/>
+        </w:tblBorders>
+        <w:tblLayout w:type="fixed"/>
+        <w:tblLook w:firstColumn="1" w:firstRow="1" w:lastColumn="0" w:lastRow="0" w:noHBand="0" w:noVBand="1" w:val="04A0"/>
+      </w:tblPr>
+      <w:tblGrid>
+        <w:gridCol w:w="9355"/>
+      </w:tblGrid>
+      <w:tr>
+        <w:trPr>
+          <w:cantSplit/>
+        </w:trPr>
+        <w:tc>
+          <w:tcPr>
+            <w:tcW w:type="dxa" w:w="9354"/>
+            <w:tcBorders>
+              <w:top w:val="nil"/>
+              <w:left w:val="single" w:sz="32" w:color="FFB800"/>
+              <w:bottom w:val="nil"/>
+              <w:right w:val="nil"/>
+            </w:tcBorders>
+            <w:shd w:val="clear" w:color="auto" w:fill="EEEEEE"/>
+            <w:tcMar>
+              <w:top w:w="120" w:type="dxa"/>
+              <w:left w:w="220" w:type="dxa"/>
+              <w:bottom w:w="120" w:type="dxa"/>
+              <w:right w:w="160" w:type="dxa"/>
+            </w:tcMar>
+          </w:tcPr>
+          <w:p>
+            <w:pPr>
+              <w:spacing w:after="60" w:before="0" w:line="276" w:lineRule="auto"/>
+              <w:jc w:val="left"/>
+            </w:pPr>
+            <w:r>
+              <w:rPr>
+                <w:rFonts w:ascii="Calibri" w:hAnsi="Calibri" w:eastAsia="Calibri"/>
+                <w:b/>
+                <w:color w:val="1A1A1A"/>
+                <w:sz w:val="21"/>
+              </w:rPr>
+              <w:t>Uso de Inteligencia Artificial</w:t>
+            </w:r>
+          </w:p>
+          <w:p>
+            <w:pPr>
+              <w:spacing w:after="60" w:before="0" w:line="276" w:lineRule="auto"/>
+              <w:jc w:val="left"/>
+            </w:pPr>
+            <w:r>
+              <w:rPr>
+                <w:rFonts w:ascii="Calibri" w:hAnsi="Calibri" w:eastAsia="Calibri"/>
+                <w:sz w:val="20"/>
+              </w:rPr>
+              <w:t>Este documento se elaboró con apoyo de IA (Claude, Anthropic). En los Anexos se detalla qué hizo la herramienta y qué debe revisar una persona, y en las Referencias se indica qué fuentes están verificadas.</w:t>
+            </w:r>
+          </w:p>
+        </w:tc>
+      </w:tr>
+    </w:tbl>
+    <w:p>
+      <w:pPr>
+        <w:spacing w:after="200" w:line="240" w:lineRule="auto"/>
+      </w:pPr>
+      <w:r>
+        <w:rPr>
+          <w:sz w:val="8"/>
+        </w:rPr>
+        <w:t xml:space="preserve"> </w:t>
+      </w:r>
+    </w:p>
     <w:p>
       <w:pPr>
         <w:pStyle w:val="Heading2"/>
@@ -17381,6 +17461,643 @@
         <w:t>Declaración sobre el uso de Inteligencia Artificial</w:t>
       </w:r>
     </w:p>
+    <w:p>
+      <w:r>
+        <w:rPr>
+          <w:rFonts w:ascii="Calibri" w:hAnsi="Calibri" w:eastAsia="Calibri"/>
+          <w:sz w:val="21"/>
+        </w:rPr>
+        <w:t xml:space="preserve">Este documento se elaboró con apoyo de </w:t>
+      </w:r>
+      <w:r>
+        <w:rPr>
+          <w:rFonts w:ascii="Calibri" w:hAnsi="Calibri" w:eastAsia="Calibri"/>
+          <w:b/>
+          <w:sz w:val="21"/>
+        </w:rPr>
+        <w:t>Claude (Anthropic)</w:t>
+      </w:r>
+      <w:r>
+        <w:rPr>
+          <w:rFonts w:ascii="Calibri" w:hAnsi="Calibri" w:eastAsia="Calibri"/>
+          <w:sz w:val="21"/>
+        </w:rPr>
+        <w:t>, un modelo de Inteligencia Artificial generativa, entre octubre de 2026. A continuación se indica con transparencia qué hizo la herramienta y qué debe revisar una persona.</w:t>
+      </w:r>
+    </w:p>
+    <w:tbl>
+      <w:tblPr>
+        <w:tblW w:type="dxa" w:w="9355"/>
+        <w:jc w:val="center"/>
+        <w:tblBorders>
+          <w:top w:val="single" w:sz="4" w:space="0" w:color="CCCCCC"/>
+          <w:left w:val="single" w:sz="4" w:space="0" w:color="CCCCCC"/>
+          <w:bottom w:val="single" w:sz="4" w:space="0" w:color="CCCCCC"/>
+          <w:right w:val="single" w:sz="4" w:space="0" w:color="CCCCCC"/>
+          <w:insideH w:val="single" w:sz="4" w:space="0" w:color="CCCCCC"/>
+          <w:insideV w:val="single" w:sz="4" w:space="0" w:color="CCCCCC"/>
+        </w:tblBorders>
+        <w:tblLayout w:type="fixed"/>
+        <w:tblLook w:firstColumn="1" w:firstRow="1" w:lastColumn="0" w:lastRow="0" w:noHBand="0" w:noVBand="1" w:val="04A0"/>
+      </w:tblPr>
+      <w:tblGrid>
+        <w:gridCol w:w="1927"/>
+        <w:gridCol w:w="3969"/>
+        <w:gridCol w:w="3458"/>
+      </w:tblGrid>
+      <w:tr>
+        <w:trPr>
+          <w:tblHeader w:val="true"/>
+        </w:trPr>
+        <w:tc>
+          <w:tcPr>
+            <w:tcW w:type="dxa" w:w="1928"/>
+            <w:shd w:val="clear" w:color="auto" w:fill="1A1A1A"/>
+            <w:tcMar>
+              <w:top w:w="70" w:type="dxa"/>
+              <w:left w:w="90" w:type="dxa"/>
+              <w:bottom w:w="70" w:type="dxa"/>
+              <w:right w:w="90" w:type="dxa"/>
+            </w:tcMar>
+          </w:tcPr>
+          <w:p>
+            <w:pPr>
+              <w:spacing w:after="0" w:before="0" w:line="240" w:lineRule="auto"/>
+              <w:jc w:val="left"/>
+            </w:pPr>
+            <w:r>
+              <w:rPr>
+                <w:rFonts w:ascii="Calibri" w:hAnsi="Calibri" w:eastAsia="Calibri"/>
+                <w:b/>
+                <w:color w:val="FFFFFF"/>
+                <w:sz w:val="17"/>
+              </w:rPr>
+              <w:t>Tarea</w:t>
+            </w:r>
+          </w:p>
+        </w:tc>
+        <w:tc>
+          <w:tcPr>
+            <w:tcW w:type="dxa" w:w="3969"/>
+            <w:shd w:val="clear" w:color="auto" w:fill="1A1A1A"/>
+            <w:tcMar>
+              <w:top w:w="70" w:type="dxa"/>
+              <w:left w:w="90" w:type="dxa"/>
+              <w:bottom w:w="70" w:type="dxa"/>
+              <w:right w:w="90" w:type="dxa"/>
+            </w:tcMar>
+          </w:tcPr>
+          <w:p>
+            <w:pPr>
+              <w:spacing w:after="0" w:before="0" w:line="240" w:lineRule="auto"/>
+              <w:jc w:val="left"/>
+            </w:pPr>
+            <w:r>
+              <w:rPr>
+                <w:rFonts w:ascii="Calibri" w:hAnsi="Calibri" w:eastAsia="Calibri"/>
+                <w:b/>
+                <w:color w:val="FFFFFF"/>
+                <w:sz w:val="17"/>
+              </w:rPr>
+              <w:t>Qué hizo la IA</w:t>
+            </w:r>
+          </w:p>
+        </w:tc>
+        <w:tc>
+          <w:tcPr>
+            <w:tcW w:type="dxa" w:w="3458"/>
+            <w:shd w:val="clear" w:color="auto" w:fill="1A1A1A"/>
+            <w:tcMar>
+              <w:top w:w="70" w:type="dxa"/>
+              <w:left w:w="90" w:type="dxa"/>
+              <w:bottom w:w="70" w:type="dxa"/>
+              <w:right w:w="90" w:type="dxa"/>
+            </w:tcMar>
+          </w:tcPr>
+          <w:p>
+            <w:pPr>
+              <w:spacing w:after="0" w:before="0" w:line="240" w:lineRule="auto"/>
+              <w:jc w:val="left"/>
+            </w:pPr>
+            <w:r>
+              <w:rPr>
+                <w:rFonts w:ascii="Calibri" w:hAnsi="Calibri" w:eastAsia="Calibri"/>
+                <w:b/>
+                <w:color w:val="FFFFFF"/>
+                <w:sz w:val="17"/>
+              </w:rPr>
+              <w:t>Qué debe revisar o decidir una persona</w:t>
+            </w:r>
+          </w:p>
+        </w:tc>
+      </w:tr>
+      <w:tr>
+        <w:trPr>
+          <w:cantSplit/>
+        </w:trPr>
+        <w:tc>
+          <w:tcPr>
+            <w:tcW w:type="dxa" w:w="1928"/>
+            <w:tcMar>
+              <w:top w:w="60" w:type="dxa"/>
+              <w:left w:w="90" w:type="dxa"/>
+              <w:bottom w:w="60" w:type="dxa"/>
+              <w:right w:w="90" w:type="dxa"/>
+            </w:tcMar>
+            <w:vAlign w:val="center"/>
+          </w:tcPr>
+          <w:p>
+            <w:pPr>
+              <w:spacing w:after="0" w:before="0" w:line="240" w:lineRule="auto"/>
+              <w:jc w:val="left"/>
+            </w:pPr>
+            <w:r>
+              <w:rPr>
+                <w:rFonts w:ascii="Calibri" w:hAnsi="Calibri" w:eastAsia="Calibri"/>
+                <w:b/>
+                <w:sz w:val="17"/>
+              </w:rPr>
+              <w:t>Datos y cálculos</w:t>
+            </w:r>
+          </w:p>
+        </w:tc>
+        <w:tc>
+          <w:tcPr>
+            <w:tcW w:type="dxa" w:w="3969"/>
+            <w:tcMar>
+              <w:top w:w="60" w:type="dxa"/>
+              <w:left w:w="90" w:type="dxa"/>
+              <w:bottom w:w="60" w:type="dxa"/>
+              <w:right w:w="90" w:type="dxa"/>
+            </w:tcMar>
+            <w:vAlign w:val="center"/>
+          </w:tcPr>
+          <w:p>
+            <w:pPr>
+              <w:spacing w:after="0" w:before="0" w:line="240" w:lineRule="auto"/>
+              <w:jc w:val="left"/>
+            </w:pPr>
+            <w:r>
+              <w:rPr>
+                <w:rFonts w:ascii="Calibri" w:hAnsi="Calibri" w:eastAsia="Calibri"/>
+                <w:sz w:val="17"/>
+              </w:rPr>
+              <w:t>Limpió la base y calculó promedios, porcentajes, comparaciones y gráficos con código (Python) guardado en la carpeta `src` del repositorio.</w:t>
+            </w:r>
+          </w:p>
+        </w:tc>
+        <w:tc>
+          <w:tcPr>
+            <w:tcW w:type="dxa" w:w="3458"/>
+            <w:tcMar>
+              <w:top w:w="60" w:type="dxa"/>
+              <w:left w:w="90" w:type="dxa"/>
+              <w:bottom w:w="60" w:type="dxa"/>
+              <w:right w:w="90" w:type="dxa"/>
+            </w:tcMar>
+            <w:vAlign w:val="center"/>
+          </w:tcPr>
+          <w:p>
+            <w:pPr>
+              <w:spacing w:after="0" w:before="0" w:line="240" w:lineRule="auto"/>
+              <w:jc w:val="left"/>
+            </w:pPr>
+            <w:r>
+              <w:rPr>
+                <w:rFonts w:ascii="Calibri" w:hAnsi="Calibri" w:eastAsia="Calibri"/>
+                <w:sz w:val="17"/>
+              </w:rPr>
+              <w:t>Revisar los scripts y repetir los cálculos ante cualquier duda. Los resultados son reproducibles.</w:t>
+            </w:r>
+          </w:p>
+        </w:tc>
+      </w:tr>
+      <w:tr>
+        <w:trPr>
+          <w:cantSplit/>
+        </w:trPr>
+        <w:tc>
+          <w:tcPr>
+            <w:tcW w:type="dxa" w:w="1928"/>
+            <w:shd w:val="clear" w:color="auto" w:fill="EEEEEE"/>
+            <w:tcMar>
+              <w:top w:w="60" w:type="dxa"/>
+              <w:left w:w="90" w:type="dxa"/>
+              <w:bottom w:w="60" w:type="dxa"/>
+              <w:right w:w="90" w:type="dxa"/>
+            </w:tcMar>
+            <w:vAlign w:val="center"/>
+          </w:tcPr>
+          <w:p>
+            <w:pPr>
+              <w:spacing w:after="0" w:before="0" w:line="240" w:lineRule="auto"/>
+              <w:jc w:val="left"/>
+            </w:pPr>
+            <w:r>
+              <w:rPr>
+                <w:rFonts w:ascii="Calibri" w:hAnsi="Calibri" w:eastAsia="Calibri"/>
+                <w:b/>
+                <w:sz w:val="17"/>
+              </w:rPr>
+              <w:t>Tarea específica de este documento</w:t>
+            </w:r>
+          </w:p>
+        </w:tc>
+        <w:tc>
+          <w:tcPr>
+            <w:tcW w:type="dxa" w:w="3969"/>
+            <w:shd w:val="clear" w:color="auto" w:fill="EEEEEE"/>
+            <w:tcMar>
+              <w:top w:w="60" w:type="dxa"/>
+              <w:left w:w="90" w:type="dxa"/>
+              <w:bottom w:w="60" w:type="dxa"/>
+              <w:right w:w="90" w:type="dxa"/>
+            </w:tcMar>
+            <w:vAlign w:val="center"/>
+          </w:tcPr>
+          <w:p>
+            <w:pPr>
+              <w:spacing w:after="0" w:before="0" w:line="240" w:lineRule="auto"/>
+              <w:jc w:val="left"/>
+            </w:pPr>
+            <w:r>
+              <w:rPr>
+                <w:rFonts w:ascii="Calibri" w:hAnsi="Calibri" w:eastAsia="Calibri"/>
+                <w:sz w:val="17"/>
+              </w:rPr>
+              <w:t>Apoyar el diseño de las visualizaciones y la redacción en lenguaje claro, adaptando los hallazgos a públicos no especializados.</w:t>
+            </w:r>
+          </w:p>
+        </w:tc>
+        <w:tc>
+          <w:tcPr>
+            <w:tcW w:type="dxa" w:w="3458"/>
+            <w:shd w:val="clear" w:color="auto" w:fill="EEEEEE"/>
+            <w:tcMar>
+              <w:top w:w="60" w:type="dxa"/>
+              <w:left w:w="90" w:type="dxa"/>
+              <w:bottom w:w="60" w:type="dxa"/>
+              <w:right w:w="90" w:type="dxa"/>
+            </w:tcMar>
+            <w:vAlign w:val="center"/>
+          </w:tcPr>
+          <w:p>
+            <w:pPr>
+              <w:spacing w:after="0" w:before="0" w:line="240" w:lineRule="auto"/>
+              <w:jc w:val="left"/>
+            </w:pPr>
+            <w:r>
+              <w:rPr>
+                <w:rFonts w:ascii="Calibri" w:hAnsi="Calibri" w:eastAsia="Calibri"/>
+                <w:sz w:val="17"/>
+              </w:rPr>
+              <w:t>Validar que el enfoque y las conclusiones correspondan al propósito del proyecto.</w:t>
+            </w:r>
+          </w:p>
+        </w:tc>
+      </w:tr>
+      <w:tr>
+        <w:trPr>
+          <w:cantSplit/>
+        </w:trPr>
+        <w:tc>
+          <w:tcPr>
+            <w:tcW w:type="dxa" w:w="1928"/>
+            <w:tcMar>
+              <w:top w:w="60" w:type="dxa"/>
+              <w:left w:w="90" w:type="dxa"/>
+              <w:bottom w:w="60" w:type="dxa"/>
+              <w:right w:w="90" w:type="dxa"/>
+            </w:tcMar>
+            <w:vAlign w:val="center"/>
+          </w:tcPr>
+          <w:p>
+            <w:pPr>
+              <w:spacing w:after="0" w:before="0" w:line="240" w:lineRule="auto"/>
+              <w:jc w:val="left"/>
+            </w:pPr>
+            <w:r>
+              <w:rPr>
+                <w:rFonts w:ascii="Calibri" w:hAnsi="Calibri" w:eastAsia="Calibri"/>
+                <w:b/>
+                <w:sz w:val="17"/>
+              </w:rPr>
+              <w:t>Respuestas abiertas</w:t>
+            </w:r>
+          </w:p>
+        </w:tc>
+        <w:tc>
+          <w:tcPr>
+            <w:tcW w:type="dxa" w:w="3969"/>
+            <w:tcMar>
+              <w:top w:w="60" w:type="dxa"/>
+              <w:left w:w="90" w:type="dxa"/>
+              <w:bottom w:w="60" w:type="dxa"/>
+              <w:right w:w="90" w:type="dxa"/>
+            </w:tcMar>
+            <w:vAlign w:val="center"/>
+          </w:tcPr>
+          <w:p>
+            <w:pPr>
+              <w:spacing w:after="0" w:before="0" w:line="240" w:lineRule="auto"/>
+              <w:jc w:val="left"/>
+            </w:pPr>
+            <w:r>
+              <w:rPr>
+                <w:rFonts w:ascii="Calibri" w:hAnsi="Calibri" w:eastAsia="Calibri"/>
+                <w:sz w:val="17"/>
+              </w:rPr>
+              <w:t>Las agrupó por temas de forma automática (clasificación preliminar).</w:t>
+            </w:r>
+          </w:p>
+        </w:tc>
+        <w:tc>
+          <w:tcPr>
+            <w:tcW w:type="dxa" w:w="3458"/>
+            <w:tcMar>
+              <w:top w:w="60" w:type="dxa"/>
+              <w:left w:w="90" w:type="dxa"/>
+              <w:bottom w:w="60" w:type="dxa"/>
+              <w:right w:w="90" w:type="dxa"/>
+            </w:tcMar>
+            <w:vAlign w:val="center"/>
+          </w:tcPr>
+          <w:p>
+            <w:pPr>
+              <w:spacing w:after="0" w:before="0" w:line="240" w:lineRule="auto"/>
+              <w:jc w:val="left"/>
+            </w:pPr>
+            <w:r>
+              <w:rPr>
+                <w:rFonts w:ascii="Calibri" w:hAnsi="Calibri" w:eastAsia="Calibri"/>
+                <w:sz w:val="17"/>
+              </w:rPr>
+              <w:t>Doble lectura humana y libro de códigos antes de citar conteos.</w:t>
+            </w:r>
+          </w:p>
+        </w:tc>
+      </w:tr>
+      <w:tr>
+        <w:trPr>
+          <w:cantSplit/>
+        </w:trPr>
+        <w:tc>
+          <w:tcPr>
+            <w:tcW w:type="dxa" w:w="1928"/>
+            <w:shd w:val="clear" w:color="auto" w:fill="EEEEEE"/>
+            <w:tcMar>
+              <w:top w:w="60" w:type="dxa"/>
+              <w:left w:w="90" w:type="dxa"/>
+              <w:bottom w:w="60" w:type="dxa"/>
+              <w:right w:w="90" w:type="dxa"/>
+            </w:tcMar>
+            <w:vAlign w:val="center"/>
+          </w:tcPr>
+          <w:p>
+            <w:pPr>
+              <w:spacing w:after="0" w:before="0" w:line="240" w:lineRule="auto"/>
+              <w:jc w:val="left"/>
+            </w:pPr>
+            <w:r>
+              <w:rPr>
+                <w:rFonts w:ascii="Calibri" w:hAnsi="Calibri" w:eastAsia="Calibri"/>
+                <w:b/>
+                <w:sz w:val="17"/>
+              </w:rPr>
+              <w:t>Redacción y diseño</w:t>
+            </w:r>
+          </w:p>
+        </w:tc>
+        <w:tc>
+          <w:tcPr>
+            <w:tcW w:type="dxa" w:w="3969"/>
+            <w:shd w:val="clear" w:color="auto" w:fill="EEEEEE"/>
+            <w:tcMar>
+              <w:top w:w="60" w:type="dxa"/>
+              <w:left w:w="90" w:type="dxa"/>
+              <w:bottom w:w="60" w:type="dxa"/>
+              <w:right w:w="90" w:type="dxa"/>
+            </w:tcMar>
+            <w:vAlign w:val="center"/>
+          </w:tcPr>
+          <w:p>
+            <w:pPr>
+              <w:spacing w:after="0" w:before="0" w:line="240" w:lineRule="auto"/>
+              <w:jc w:val="left"/>
+            </w:pPr>
+            <w:r>
+              <w:rPr>
+                <w:rFonts w:ascii="Calibri" w:hAnsi="Calibri" w:eastAsia="Calibri"/>
+                <w:sz w:val="17"/>
+              </w:rPr>
+              <w:t>Redactó, organizó y diseñó tablas, gráficos, diagramas e infografías (ilustraciones propias, sin fotografías de personas).</w:t>
+            </w:r>
+          </w:p>
+        </w:tc>
+        <w:tc>
+          <w:tcPr>
+            <w:tcW w:type="dxa" w:w="3458"/>
+            <w:shd w:val="clear" w:color="auto" w:fill="EEEEEE"/>
+            <w:tcMar>
+              <w:top w:w="60" w:type="dxa"/>
+              <w:left w:w="90" w:type="dxa"/>
+              <w:bottom w:w="60" w:type="dxa"/>
+              <w:right w:w="90" w:type="dxa"/>
+            </w:tcMar>
+            <w:vAlign w:val="center"/>
+          </w:tcPr>
+          <w:p>
+            <w:pPr>
+              <w:spacing w:after="0" w:before="0" w:line="240" w:lineRule="auto"/>
+              <w:jc w:val="left"/>
+            </w:pPr>
+            <w:r>
+              <w:rPr>
+                <w:rFonts w:ascii="Calibri" w:hAnsi="Calibri" w:eastAsia="Calibri"/>
+                <w:sz w:val="17"/>
+              </w:rPr>
+              <w:t>Revisar el tono, el contenido y la adecuación institucional (por ejemplo, insertar el logo oficial).</w:t>
+            </w:r>
+          </w:p>
+        </w:tc>
+      </w:tr>
+      <w:tr>
+        <w:trPr>
+          <w:cantSplit/>
+        </w:trPr>
+        <w:tc>
+          <w:tcPr>
+            <w:tcW w:type="dxa" w:w="1928"/>
+            <w:tcMar>
+              <w:top w:w="60" w:type="dxa"/>
+              <w:left w:w="90" w:type="dxa"/>
+              <w:bottom w:w="60" w:type="dxa"/>
+              <w:right w:w="90" w:type="dxa"/>
+            </w:tcMar>
+            <w:vAlign w:val="center"/>
+          </w:tcPr>
+          <w:p>
+            <w:pPr>
+              <w:spacing w:after="0" w:before="0" w:line="240" w:lineRule="auto"/>
+              <w:jc w:val="left"/>
+            </w:pPr>
+            <w:r>
+              <w:rPr>
+                <w:rFonts w:ascii="Calibri" w:hAnsi="Calibri" w:eastAsia="Calibri"/>
+                <w:b/>
+                <w:sz w:val="17"/>
+              </w:rPr>
+              <w:t>Bibliografía</w:t>
+            </w:r>
+          </w:p>
+        </w:tc>
+        <w:tc>
+          <w:tcPr>
+            <w:tcW w:type="dxa" w:w="3969"/>
+            <w:tcMar>
+              <w:top w:w="60" w:type="dxa"/>
+              <w:left w:w="90" w:type="dxa"/>
+              <w:bottom w:w="60" w:type="dxa"/>
+              <w:right w:w="90" w:type="dxa"/>
+            </w:tcMar>
+            <w:vAlign w:val="center"/>
+          </w:tcPr>
+          <w:p>
+            <w:pPr>
+              <w:spacing w:after="0" w:before="0" w:line="240" w:lineRule="auto"/>
+              <w:jc w:val="left"/>
+            </w:pPr>
+            <w:r>
+              <w:rPr>
+                <w:rFonts w:ascii="Calibri" w:hAnsi="Calibri" w:eastAsia="Calibri"/>
+                <w:sz w:val="17"/>
+              </w:rPr>
+              <w:t>Seleccionó las referencias a partir de su conocimiento de la literatura y, cuando se indica, de resúmenes encontrados en la web.</w:t>
+            </w:r>
+          </w:p>
+        </w:tc>
+        <w:tc>
+          <w:tcPr>
+            <w:tcW w:type="dxa" w:w="3458"/>
+            <w:tcMar>
+              <w:top w:w="60" w:type="dxa"/>
+              <w:left w:w="90" w:type="dxa"/>
+              <w:bottom w:w="60" w:type="dxa"/>
+              <w:right w:w="90" w:type="dxa"/>
+            </w:tcMar>
+            <w:vAlign w:val="center"/>
+          </w:tcPr>
+          <w:p>
+            <w:pPr>
+              <w:spacing w:after="0" w:before="0" w:line="240" w:lineRule="auto"/>
+              <w:jc w:val="left"/>
+            </w:pPr>
+            <w:r>
+              <w:rPr>
+                <w:rFonts w:ascii="Calibri" w:hAnsi="Calibri" w:eastAsia="Calibri"/>
+                <w:sz w:val="17"/>
+              </w:rPr>
+              <w:t>Verificar autores, volumen, páginas y DOI en la fuente antes de publicar. Lo no verificado está marcado.</w:t>
+            </w:r>
+          </w:p>
+        </w:tc>
+      </w:tr>
+      <w:tr>
+        <w:trPr>
+          <w:cantSplit/>
+        </w:trPr>
+        <w:tc>
+          <w:tcPr>
+            <w:tcW w:type="dxa" w:w="1928"/>
+            <w:shd w:val="clear" w:color="auto" w:fill="EEEEEE"/>
+            <w:tcMar>
+              <w:top w:w="60" w:type="dxa"/>
+              <w:left w:w="90" w:type="dxa"/>
+              <w:bottom w:w="60" w:type="dxa"/>
+              <w:right w:w="90" w:type="dxa"/>
+            </w:tcMar>
+            <w:vAlign w:val="center"/>
+          </w:tcPr>
+          <w:p>
+            <w:pPr>
+              <w:spacing w:after="0" w:before="0" w:line="240" w:lineRule="auto"/>
+              <w:jc w:val="left"/>
+            </w:pPr>
+            <w:r>
+              <w:rPr>
+                <w:rFonts w:ascii="Calibri" w:hAnsi="Calibri" w:eastAsia="Calibri"/>
+                <w:b/>
+                <w:sz w:val="17"/>
+              </w:rPr>
+              <w:t>Datos personales</w:t>
+            </w:r>
+          </w:p>
+        </w:tc>
+        <w:tc>
+          <w:tcPr>
+            <w:tcW w:type="dxa" w:w="3969"/>
+            <w:shd w:val="clear" w:color="auto" w:fill="EEEEEE"/>
+            <w:tcMar>
+              <w:top w:w="60" w:type="dxa"/>
+              <w:left w:w="90" w:type="dxa"/>
+              <w:bottom w:w="60" w:type="dxa"/>
+              <w:right w:w="90" w:type="dxa"/>
+            </w:tcMar>
+            <w:vAlign w:val="center"/>
+          </w:tcPr>
+          <w:p>
+            <w:pPr>
+              <w:spacing w:after="0" w:before="0" w:line="240" w:lineRule="auto"/>
+              <w:jc w:val="left"/>
+            </w:pPr>
+            <w:r>
+              <w:rPr>
+                <w:rFonts w:ascii="Calibri" w:hAnsi="Calibri" w:eastAsia="Calibri"/>
+                <w:sz w:val="17"/>
+              </w:rPr>
+              <w:t>No se incluyeron nombres, correos ni códigos de estudiantes; las citas textuales son anónimas.</w:t>
+            </w:r>
+          </w:p>
+        </w:tc>
+        <w:tc>
+          <w:tcPr>
+            <w:tcW w:type="dxa" w:w="3458"/>
+            <w:shd w:val="clear" w:color="auto" w:fill="EEEEEE"/>
+            <w:tcMar>
+              <w:top w:w="60" w:type="dxa"/>
+              <w:left w:w="90" w:type="dxa"/>
+              <w:bottom w:w="60" w:type="dxa"/>
+              <w:right w:w="90" w:type="dxa"/>
+            </w:tcMar>
+            <w:vAlign w:val="center"/>
+          </w:tcPr>
+          <w:p>
+            <w:pPr>
+              <w:spacing w:after="0" w:before="0" w:line="240" w:lineRule="auto"/>
+              <w:jc w:val="left"/>
+            </w:pPr>
+            <w:r>
+              <w:rPr>
+                <w:rFonts w:ascii="Calibri" w:hAnsi="Calibri" w:eastAsia="Calibri"/>
+                <w:sz w:val="17"/>
+              </w:rPr>
+              <w:t>Mantener la confidencialidad al difundir.</w:t>
+            </w:r>
+          </w:p>
+        </w:tc>
+      </w:tr>
+    </w:tbl>
+    <w:p>
+      <w:pPr>
+        <w:spacing w:after="240" w:line="240" w:lineRule="auto"/>
+      </w:pPr>
+      <w:r>
+        <w:rPr>
+          <w:sz w:val="8"/>
+        </w:rPr>
+        <w:t xml:space="preserve"> </w:t>
+      </w:r>
+    </w:p>
     <w:tbl>
       <w:tblPr>
         <w:tblW w:type="dxa" w:w="9355"/>
@@ -17431,7 +18148,7 @@
                 <w:color w:val="1A1A1A"/>
                 <w:sz w:val="21"/>
               </w:rPr>
-              <w:t>Este documento se elaboró con apoyo de Inteligencia Artificial</w:t>
+              <w:t>Responsabilidad</w:t>
             </w:r>
           </w:p>
           <w:p>
@@ -17444,7 +18161,7 @@
                 <w:rFonts w:ascii="Calibri" w:hAnsi="Calibri" w:eastAsia="Calibri"/>
                 <w:sz w:val="20"/>
               </w:rPr>
-              <w:t xml:space="preserve">Se utilizó </w:t>
+              <w:t xml:space="preserve">La IA </w:t>
             </w:r>
             <w:r>
               <w:rPr>
@@ -17452,14 +18169,14 @@
                 <w:b/>
                 <w:sz w:val="20"/>
               </w:rPr>
-              <w:t>Claude (Anthropic), modelo de IA generativa</w:t>
+              <w:t>no reemplaza el juicio experto</w:t>
             </w:r>
             <w:r>
               <w:rPr>
                 <w:rFonts w:ascii="Calibri" w:hAnsi="Calibri" w:eastAsia="Calibri"/>
                 <w:sz w:val="20"/>
               </w:rPr>
-              <w:t>, como herramienta de apoyo para: (1) limpiar y calcular los resultados de la base de datos con código reproducible; (2) apoyar el diseño de las visualizaciones y la redacción en lenguaje claro, adaptando los hallazgos a públicos no especializados; (3) redactar, organizar y diseñar los gráficos y diagramas; y (4) clasificar preliminarmente las respuestas abiertas por temas.</w:t>
+              <w:t xml:space="preserve"> ni asume responsabilidad por las decisiones. Las interpretaciones y recomendaciones deben ser revisadas y asumidas por el equipo responsable del Proyecto La Puerta antes de su difusión institucional.</w:t>
             </w:r>
           </w:p>
           <w:p>
@@ -17470,30 +18187,9 @@
             <w:r>
               <w:rPr>
                 <w:rFonts w:ascii="Calibri" w:hAnsi="Calibri" w:eastAsia="Calibri"/>
-                <w:b/>
                 <w:sz w:val="20"/>
               </w:rPr>
-              <w:t>La IA no reemplaza el juicio experto.</w:t>
-            </w:r>
-            <w:r>
-              <w:rPr>
-                <w:rFonts w:ascii="Calibri" w:hAnsi="Calibri" w:eastAsia="Calibri"/>
-                <w:sz w:val="20"/>
-              </w:rPr>
-              <w:t xml:space="preserve"> La codificación temática automática es preliminar y debe ser validada por una persona (idealmente con doble codificación). Las interpretaciones, decisiones y recomendaciones deben ser revisadas y asumidas por el equipo responsable del Proyecto La Puerta antes de su difusión institucional.</w:t>
-            </w:r>
-          </w:p>
-          <w:p>
-            <w:pPr>
-              <w:spacing w:after="60" w:before="0" w:line="276" w:lineRule="auto"/>
-              <w:jc w:val="left"/>
-            </w:pPr>
-            <w:r>
-              <w:rPr>
-                <w:rFonts w:ascii="Calibri" w:hAnsi="Calibri" w:eastAsia="Calibri"/>
-                <w:sz w:val="20"/>
-              </w:rPr>
-              <w:t>No se incluyeron nombres, correos ni códigos de estudiantes. Las citas textuales son anónimas.</w:t>
+              <w:t>Si algún dato de este documento no coincide con las fuentes, prevalecen las fuentes originales.</w:t>
             </w:r>
           </w:p>
         </w:tc>

</xml_diff>

<commit_message>
La Puerta: auditoría y verificación (K), correcciones en productos A–J y ZIP actualizado
Co-Authored-By: Claude Sonnet 5.5 <noreply@anthropic.com>
Claude-Session: https://claude.ai/code/session_01LMGDS2vkeoRvyaCNTXCQYn
</commit_message>
<xml_diff>
--- a/La_Puerta_Informes/informes/A_Informe_Descriptivo.docx
+++ b/La_Puerta_Informes/informes/A_Informe_Descriptivo.docx
@@ -1719,7 +1719,7 @@
         <w:pStyle w:val="Heading3"/>
       </w:pPr>
       <w:r>
-        <w:t>3.1 Qué se preguntó y cómo se respondió</w:t>
+        <w:t>Qué se preguntó y cómo se respondió</w:t>
       </w:r>
     </w:p>
     <w:p>
@@ -2272,7 +2272,7 @@
         <w:pStyle w:val="Heading3"/>
       </w:pPr>
       <w:r>
-        <w:t>3.2 Cómo se calcularon los resultados</w:t>
+        <w:t>Cómo se calcularon los resultados</w:t>
       </w:r>
     </w:p>
     <w:p>
@@ -2413,7 +2413,7 @@
         <w:pStyle w:val="Heading3"/>
       </w:pPr>
       <w:r>
-        <w:t>3.3 Calidad de los datos</w:t>
+        <w:t>Calidad de los datos</w:t>
       </w:r>
     </w:p>
     <w:p>
@@ -2844,7 +2844,7 @@
         <w:pStyle w:val="Heading3"/>
       </w:pPr>
       <w:r>
-        <w:t>5.1 Panorama general</w:t>
+        <w:t>Panorama general</w:t>
       </w:r>
     </w:p>
     <w:p>
@@ -3048,7 +3048,7 @@
         <w:pStyle w:val="Heading3"/>
       </w:pPr>
       <w:r>
-        <w:t>5.2 Afirmación por afirmación</w:t>
+        <w:t>Afirmación por afirmación</w:t>
       </w:r>
     </w:p>
     <w:p>
@@ -6601,7 +6601,7 @@
         <w:pStyle w:val="Heading3"/>
       </w:pPr>
       <w:r>
-        <w:t>5.3 Las cinco dimensiones</w:t>
+        <w:t>Las cinco dimensiones</w:t>
       </w:r>
     </w:p>
     <w:p>
@@ -7602,7 +7602,7 @@
         <w:pStyle w:val="Heading3"/>
       </w:pPr>
       <w:r>
-        <w:t>5.4 Un vistazo a cada dimensión</w:t>
+        <w:t>Un vistazo a cada dimensión</w:t>
       </w:r>
     </w:p>
     <w:p>
@@ -7798,7 +7798,7 @@
         <w:pStyle w:val="Heading3"/>
       </w:pPr>
       <w:r>
-        <w:t>5.5 Diferencias entre perfiles de estudiantes</w:t>
+        <w:t>Diferencias entre perfiles de estudiantes</w:t>
       </w:r>
     </w:p>
     <w:p>
@@ -12368,7 +12368,7 @@
         <w:pStyle w:val="Heading3"/>
       </w:pPr>
       <w:r>
-        <w:t>5.6 Semáforo oficial por estudiante</w:t>
+        <w:t>Semáforo oficial por estudiante</w:t>
       </w:r>
     </w:p>
     <w:p>
@@ -12498,7 +12498,7 @@
         <w:pStyle w:val="Heading3"/>
       </w:pPr>
       <w:r>
-        <w:t>6.1 ¿Cuál ha sido tu aprendizaje más valioso?</w:t>
+        <w:t>¿Cuál ha sido tu aprendizaje más valioso?</w:t>
       </w:r>
     </w:p>
     <w:p>
@@ -12763,7 +12763,7 @@
         <w:pStyle w:val="Heading3"/>
       </w:pPr>
       <w:r>
-        <w:t>6.2 ¿Qué apoyo debería incorporar la institución antes de la práctica?</w:t>
+        <w:t>¿Qué apoyo debería incorporar la institución antes de la práctica?</w:t>
       </w:r>
     </w:p>
     <w:p>

</xml_diff>